<commit_message>
Added User stories to main doc, and Jira Docs to FYP doc.
</commit_message>
<xml_diff>
--- a/Use Cases/Add Database.docx
+++ b/Use Cases/Add Database.docx
@@ -74,7 +74,21 @@
                 <w:bCs/>
                 <w:sz w:val="24"/>
               </w:rPr>
-              <w:t>Add Database</w:t>
+              <w:t>Add</w:t>
+            </w:r>
+            <w:r>
+              <w:rPr>
+                <w:bCs/>
+                <w:sz w:val="24"/>
+              </w:rPr>
+              <w:t>ing a</w:t>
+            </w:r>
+            <w:r>
+              <w:rPr>
+                <w:bCs/>
+                <w:sz w:val="24"/>
+              </w:rPr>
+              <w:t xml:space="preserve"> Database</w:t>
             </w:r>
           </w:p>
         </w:tc>
@@ -1345,14 +1359,7 @@
                 <w:bCs/>
                 <w:sz w:val="24"/>
               </w:rPr>
-              <w:t xml:space="preserve">System </w:t>
-            </w:r>
-            <w:r>
-              <w:rPr>
-                <w:bCs/>
-                <w:sz w:val="24"/>
-              </w:rPr>
-              <w:t>Saves correct connection to memory and displays UI notification to show success.</w:t>
+              <w:t>System Saves correct connection to memory and displays UI notification to show success.</w:t>
             </w:r>
           </w:p>
           <w:p>
@@ -1651,22 +1658,7 @@
                 <w:bCs/>
                 <w:sz w:val="24"/>
               </w:rPr>
-              <w:lastRenderedPageBreak/>
-              <w:t>System received a</w:t>
-            </w:r>
-            <w:r>
-              <w:rPr>
-                <w:bCs/>
-                <w:sz w:val="24"/>
-              </w:rPr>
-              <w:t xml:space="preserve"> failed</w:t>
-            </w:r>
-            <w:r>
-              <w:rPr>
-                <w:bCs/>
-                <w:sz w:val="24"/>
-              </w:rPr>
-              <w:t xml:space="preserve"> response from database </w:t>
+              <w:t xml:space="preserve">System received a failed response from database </w:t>
             </w:r>
           </w:p>
           <w:p>
@@ -1717,35 +1709,21 @@
                 <w:bCs/>
                 <w:sz w:val="24"/>
               </w:rPr>
-              <w:t xml:space="preserve">System </w:t>
-            </w:r>
-            <w:r>
-              <w:rPr>
-                <w:bCs/>
-                <w:sz w:val="24"/>
-              </w:rPr>
-              <w:t>displays invalid connection details screen.</w:t>
-            </w:r>
-          </w:p>
-          <w:p>
-            <w:pPr>
-              <w:rPr>
-                <w:sz w:val="24"/>
-              </w:rPr>
-            </w:pPr>
-            <w:r>
-              <w:rPr>
-                <w:bCs/>
-                <w:sz w:val="24"/>
-              </w:rPr>
-              <w:t>Returns to connection form.</w:t>
-            </w:r>
-            <w:r>
-              <w:rPr>
-                <w:bCs/>
-                <w:sz w:val="24"/>
-              </w:rPr>
-              <w:t xml:space="preserve"> </w:t>
+              <w:t>System displays invalid connection details screen.</w:t>
+            </w:r>
+          </w:p>
+          <w:p>
+            <w:pPr>
+              <w:rPr>
+                <w:sz w:val="24"/>
+              </w:rPr>
+            </w:pPr>
+            <w:r>
+              <w:rPr>
+                <w:bCs/>
+                <w:sz w:val="24"/>
+              </w:rPr>
+              <w:t xml:space="preserve">Returns to connection form. </w:t>
             </w:r>
           </w:p>
         </w:tc>

</xml_diff>